<commit_message>
Apply book creating guide to Shorthand for Murder: left-aligned text, By Skybee title line, full metadata, regenerated docx and KDP answers
Co-Authored-By: Claude Haiku 5.5 <noreply@anthropic.com>
Claude-Session: https://claude.ai/code/session_01MZeVJcyf7XvKRRCE6AUkLk
</commit_message>
<xml_diff>
--- a/ebooks-Final/shorthand-for-murder-a-lantern-bay-cozy-mystery-book-1/manuscript.docx
+++ b/ebooks-Final/shorthand-for-murder-a-lantern-bay-cozy-mystery-book-1/manuscript.docx
@@ -20,13 +20,13 @@
         <w:t xml:space="preserve">A Lantern Bay Cozy Mystery, Book 1</w:t>
       </w:r>
     </w:p>
-    <w:bookmarkStart w:id="20" w:name="skybee"/>
+    <w:bookmarkStart w:id="20" w:name="by-skybee"/>
     <w:p>
       <w:pPr>
         <w:pStyle w:val="Heading3"/>
       </w:pPr>
       <w:r>
-        <w:t xml:space="preserve">Skybee</w:t>
+        <w:t xml:space="preserve">By Skybee</w:t>
       </w:r>
     </w:p>
     <w:p>

</xml_diff>

<commit_message>
Shorthand for Murder: proofreading pass 1 (continuity and timing fixes)
Fixes from a full read of the manuscript: recess and adjournment timing,
stair count, clerk upload time, vote tally, Bernice's address, company
name and drive handling, the state records contact renamed to Irene
Lasko, and the audit-log login time. Rebuilt manuscript.docx, the EPUB,
and metadata word count. Guide section 21 prompt brief now points to
book-creating-guide.docx. Cover files not included (awaiting approval).

Co-Authored-By: Claude Haiku 5.5 <noreply@anthropic.com>
Claude-Session: https://claude.ai/code/session_01Kcf7LA2NTspmKRjqAL51Lx
</commit_message>
<xml_diff>
--- a/ebooks-Final/shorthand-for-murder-a-lantern-bay-cozy-mystery-book-1/manuscript.docx
+++ b/ebooks-Final/shorthand-for-murder-a-lantern-bay-cozy-mystery-book-1/manuscript.docx
@@ -93,7 +93,7 @@
         <w:pStyle w:val="BodyText"/>
       </w:pPr>
       <w:r>
-        <w:t xml:space="preserve">At six fifty-two, the room was filling. Ruth Kalinowski, the council chair, was sorting papers at the head of the long table under the tall windows. Through the glass behind her, the bay had turned the flat silver it took on in the evenings of a hot July, and the masts in the marina below Front Street stood very still against it. Ed Matlin and Carla Sayer sat together on the left side of the dais, talking in low voices and laughing at something on Carla’s phone. Lorraine Haskins sat at the far end of the dais with a ball of blue yarn in her lap and her needles going, as she had done at every meeting since the nineties. Ted Vance, who had not yet decided how he would vote on anything since he was elected, was rearranging his pens for the third time.</w:t>
+        <w:t xml:space="preserve">At six fifty-two, the room was filling. Ruth Kalinowski, the council chair, was sorting papers at the head of the long table under the tall windows. Through the glass behind her, the bay had turned the flat silver it took on in the evenings of a hot July, and the masts in the marina below Front Street stood very still against it. Ed Matlin and Carla Sayer sat together on the left side of the dais, talking in low voices and laughing at something on Carla’s phone. Lorraine Haskins sat at the far end of the dais with a ball of blue yarn in her lap and her needles going, as she had done at every meeting since the nineties. Ted Vance, who had not decided how he would vote on anything since he was elected, was rearranging his pens for the third time.</w:t>
       </w:r>
     </w:p>
     <w:p>
@@ -861,7 +861,7 @@
         <w:pStyle w:val="BodyText"/>
       </w:pPr>
       <w:r>
-        <w:t xml:space="preserve">It was the last full sentence Dale Whitcomb ever spoke in her hearing.</w:t>
+        <w:t xml:space="preserve">It was the last thing Dale Whitcomb ever said to her face.</w:t>
       </w:r>
     </w:p>
     <w:bookmarkEnd w:id="22"/>
@@ -1275,7 +1275,7 @@
         <w:pStyle w:val="BodyText"/>
       </w:pPr>
       <w:r>
-        <w:t xml:space="preserve">She sat down again and looked at the screen for a long moment. It was ten thirty-two in the evening. Dale had called her at nine forty-one, while she was still in the hall with her bag over her shoulder, watching the last of the council members leave. He had not called her in the eight years she had known him. The town had a number for transcripts, and a number for the Gazette, and a number for her email. Dale had always preferred to shout across a room.</w:t>
+        <w:t xml:space="preserve">She sat down again and looked at the screen for a long moment. It was ten thirty-two in the evening. Dale had called her at nine forty-one, while she was driving home with the radio off and the window down, and she had not heard the phone over the wind. He had not called her in the eight years she had known him. The town had a number for transcripts, and a number for the Gazette, and a number for her email. Dale had always preferred to shout across a room.</w:t>
       </w:r>
     </w:p>
     <w:p>
@@ -1391,7 +1391,7 @@
         <w:pStyle w:val="BodyText"/>
       </w:pPr>
       <w:r>
-        <w:t xml:space="preserve">Half of the room had been at the back of the room at one point or another that night. Dale had not said who. He had only said that someone had said it, and that he had heard.</w:t>
+        <w:t xml:space="preserve">Half the room had drifted toward the back at one point or another that night. Dale had not said who. He had only said that someone had said it, and that he had heard.</w:t>
       </w:r>
     </w:p>
     <w:p>
@@ -2007,7 +2007,7 @@
         <w:t xml:space="preserve">“</w:t>
       </w:r>
       <w:r>
-        <w:t xml:space="preserve">From the landing to the bottom of the stairs. It looks like his heart went first. We found his pills in his shirt pocket, the ones he has for his angina, and the bottle was half empty. Lyle thinks he was coming down to check the ramp lines before the morning tide. The dock’s wet from the rain last night and the bottom step is slick. It’s a bad fall, Greta. I’m sorry.</w:t>
+        <w:t xml:space="preserve">From the landing to the bottom of the stairs. It looks like his heart went first. We found his pills in his shirt pocket, the ones he has for his angina, and the bottle was half-empty. Lyle thinks he was coming down to check the ramp lines before the morning tide. The dock’s wet from the rain last night and the bottom step is slick. It’s a bad fall, Greta. I’m sorry.</w:t>
       </w:r>
       <w:r>
         <w:t xml:space="preserve">”</w:t>
@@ -2479,7 +2479,7 @@
         <w:pStyle w:val="BodyText"/>
       </w:pPr>
       <w:r>
-        <w:t xml:space="preserve">It was a plain stretch of gravel and crushed shell that ran from the front of the Harbor Office down along the side of the building to the back, where the commission’s trucks were parked and where a single tall light pole stood over a cluster of old oil drums. Beyond the drums, a row of cedar hedging hid the fuel tanks from the marina road. The back door stood open. The concrete landing outside it was about five feet deep and had a rusted iron railing along one side. From the landing, a flight of fourteen concrete steps ran down to the boat ramp, which sloped into the water and had a wooden walkway along its north edge where the dock lines were tied.</w:t>
+        <w:t xml:space="preserve">It was a plain stretch of gravel and crushed shell that ran from the front of the Harbor Office down along the side of the building to the back, where the commission’s trucks were parked and where a single tall light pole stood over a cluster of old oil drums. Beyond the drums, a row of cedar hedging hid the fuel tanks from the marina road. The back door stood open. The concrete landing outside it was about five feet deep and had a rusted iron railing along one side. From the landing, a flight of thirteen concrete steps ran down to the boat ramp, which sloped into the water and had a wooden walkway along its north edge where the dock lines were tied.</w:t>
       </w:r>
     </w:p>
     <w:p>
@@ -4892,7 +4892,7 @@
         <w:pStyle w:val="BodyText"/>
       </w:pPr>
       <w:r>
-        <w:t xml:space="preserve">No words had been recorded. The tape had been silent for fourteen minutes. She had marked it herself, with her own time-key:</w:t>
+        <w:t xml:space="preserve">No words had been recorded. The tape had been silent for fifteen minutes. She had marked it herself, with her own time-key:</w:t>
       </w:r>
       <w:r>
         <w:t xml:space="preserve"> </w:t>
@@ -5159,7 +5159,7 @@
         <w:pStyle w:val="BodyText"/>
       </w:pPr>
       <w:r>
-        <w:t xml:space="preserve">It was worse than the number. The same page had the council reconvening at 9:05, and then, a few lines lower, adjourning at 8:58, eight minutes before it had come back into session. Nobody could adjourn a meeting before it resumed, and the clerk who had typed that line had not noticed that it contradicted the line above it. 16 minutes. 16 minutes in which the record of the evening had been cut short, and a vote had been added, and a sentence had been put into the mouth of a man who had been sitting silently in his chair.</w:t>
+        <w:t xml:space="preserve">It was worse than the number. The same page had the council reconvening at 9:05, and then, a few lines lower, adjourning at 8:58, seven minutes before it had come back into session. Nobody could adjourn a meeting before it resumed, and the clerk who had typed that line had not noticed that it contradicted the line above it. Sixteen minutes. 16 minutes in which the record of the evening had been cut short, and a vote had been added, and a sentence had been put into the mouth of a man who had been sitting silently in his chair.</w:t>
       </w:r>
     </w:p>
     <w:p>
@@ -6270,7 +6270,7 @@
         <w:t xml:space="preserve">“</w:t>
       </w:r>
       <w:r>
-        <w:t xml:space="preserve">I put it on the drive myself on Tuesday night. 10:40, I think, I came back from the Center and I uploaded it from my laptop before I went home. I remember because I was so tired I had to type my password twice.</w:t>
+        <w:t xml:space="preserve">I put it on the drive myself on Tuesday night. 10:40, I think, from my laptop at the kitchen table, before Bernice’s text came in. I remember because I was so tired I had to type my password twice.</w:t>
       </w:r>
       <w:r>
         <w:t xml:space="preserve">”</w:t>
@@ -7000,7 +7000,7 @@
         <w:t xml:space="preserve">“</w:t>
       </w:r>
       <w:r>
-        <w:t xml:space="preserve">Tessa Quill signed in last night at twenty-five to ten.</w:t>
+        <w:t xml:space="preserve">Tessa Quill signed in on Tuesday night at twenty-five to ten.</w:t>
       </w:r>
       <w:r>
         <w:t xml:space="preserve">”</w:t>
@@ -7239,7 +7239,7 @@
         <w:pStyle w:val="BodyText"/>
       </w:pPr>
       <w:r>
-        <w:t xml:space="preserve">Greta thought about the tape folded into her canvas bag, and the bangles on a wrist that had been held in a fist at the foot of the Harbor Office steps, and a man in a tan linen jacket walking beside a coffee urn with his head bent low.</w:t>
+        <w:t xml:space="preserve">Greta thought about the tape folded into her canvas bag, and the bangles Bernice Oakes had held in her fist at the foot of the Harbor Office steps, and a man in a tan linen jacket walking beside a coffee urn with his head bent low.</w:t>
       </w:r>
     </w:p>
     <w:p>
@@ -9301,7 +9301,7 @@
         <w:t xml:space="preserve">“</w:t>
       </w:r>
       <w:r>
-        <w:t xml:space="preserve">It was after ten. I gave Gordon the folder in his office. He didn’t look at it. He just said,</w:t>
+        <w:t xml:space="preserve">It was after ten. I gave Gordon the folder in his office, all of it except the one page I had folded into my own green folder. He didn’t look at it. He just said,</w:t>
       </w:r>
       <w:r>
         <w:t xml:space="preserve"> </w:t>
@@ -9955,7 +9955,7 @@
         <w:pStyle w:val="BodyText"/>
       </w:pPr>
       <w:r>
-        <w:t xml:space="preserve">Tessa nodded slowly. Then she looked down at the green folder under her hand, opened the clasp, and lifted out a single sheet of paper. It was the original survey plat, with its real stamp and its real date. She had kept it in the folder all along, folded in quarters. She held it out to Greta with both hands, as carefully as if it were a letter from someone who had died.</w:t>
+        <w:t xml:space="preserve">Tessa nodded slowly. Then she looked down at the green folder under her hand, opened the clasp, and lifted out a single sheet of paper. It was the original survey plat, with its real stamp and its real date. She had kept it apart from the rest all along, folded in quarters. She held it out to Greta with both hands, as carefully as if it were a letter from someone who had died.</w:t>
       </w:r>
     </w:p>
     <w:p>
@@ -10269,7 +10269,7 @@
           <w:iCs/>
           <w:i/>
         </w:rPr>
-        <w:t xml:space="preserve">7/14 9:22 PM</w:t>
+        <w:t xml:space="preserve">7/14 9:52 PM</w:t>
       </w:r>
       <w:r>
         <w:t xml:space="preserve">.</w:t>
@@ -10908,7 +10908,7 @@
         <w:pStyle w:val="BodyText"/>
       </w:pPr>
       <w:r>
-        <w:t xml:space="preserve">She had typed no word between 8:50 and 9:05. She had typed no word because nothing had been said in the room to type. She knew that, and she had known it at the table, and she had known it again when she read the minutes at the library. But the tape gave her the thing the minutes could not. It gave her the blank space itself, a stretch of paper a little more than fourteen minutes long, with nothing on it at all, like a page left open on purpose.</w:t>
+        <w:t xml:space="preserve">She had typed no word between 8:50 and 9:05. She had typed no word because nothing had been said in the room to type. She knew that, and she had known it at the table, and she had known it again when she read the minutes at the library. But the tape gave her the thing the minutes could not. It gave her the blank space itself, a stretch of paper fifteen minutes long, with nothing on it at all, like a page left open on purpose.</w:t>
       </w:r>
     </w:p>
     <w:p>
@@ -11444,7 +11444,7 @@
         <w:pStyle w:val="BodyText"/>
       </w:pPr>
       <w:r>
-        <w:t xml:space="preserve">Greta stood up and went to the bookshelf beside the fireplace. The shelf held the paperbacks she could never bear to give away, and behind them, in a flat cardboard box that had once held a box of legal pads, she kept a stack of old transcripts from the Carrow County courthouse. Most of them were from her own years at the bench, but a few were from before her time, copies that a retired judge had given her as a kind of wedding gift when she first started. She pulled out a bundle of them, held together with a red rubber band, and carried it back to the table.</w:t>
+        <w:t xml:space="preserve">Greta stood up and went to the bookshelf beside the fireplace. The shelf held the paperbacks she could never bear to give away, and behind them, in a flat cardboard box that had once held a box of legal pads, she kept a stack of old transcripts from the Carrow County courthouse. Most of them were from her own years at the bench, but a few were from before her time, copies that a retired judge had given her as a kind of welcome gift when she first started on the bench. She pulled out a bundle of them, held together with a red rubber band, and carried it back to the table.</w:t>
       </w:r>
     </w:p>
     <w:p>
@@ -11780,7 +11780,7 @@
         <w:t xml:space="preserve">“</w:t>
       </w:r>
       <w:r>
-        <w:t xml:space="preserve">That’s not proof. A court can’t convict on a verbal tic. But Greta Lowe can write down what she heard, and what she heard was a man saying things in his own voice, and what the clerk typed was a voice that wasn’t his, in a sentence Bernice Oakes would have written.</w:t>
+        <w:t xml:space="preserve">That’s not proof. A court can’t convict on a verbal tic. But I can write down what I heard, and what I heard was a man saying things in his own voice, and what the clerk typed was a voice that wasn’t his, in a sentence Bernice Oakes would have written.</w:t>
       </w:r>
       <w:r>
         <w:t xml:space="preserve">”</w:t>
@@ -12862,7 +12862,7 @@
         <w:pStyle w:val="BodyText"/>
       </w:pPr>
       <w:r>
-        <w:t xml:space="preserve">Her phone buzzed again, a few minutes later, while she was still sitting in the car. This time it was an email, from an address she knew well, though she had not seen it in nearly two years. It came from a domain she recognized at once, the small private firm in Fennick Falls that had been, for the better part of a decade, her most dogged professional rival.</w:t>
+        <w:t xml:space="preserve">Her phone buzzed again, a few minutes later, while she was still sitting in the car. This time it was an email, from an address she knew well, though she had not seen it in nearly two years. It came from a domain she recognized at once: Oakes Transcription, in Fennick Falls, the firm of a woman she had once sat beside for years in the courthouse.</w:t>
       </w:r>
     </w:p>
     <w:p>
@@ -13439,7 +13439,7 @@
         <w:t xml:space="preserve">“</w:t>
       </w:r>
       <w:r>
-        <w:t xml:space="preserve">Greta, the draft was created at ten fifty-eight on Tuesday night. Two hours after Ruth gaveled the meeting closed. And Bernice sent me the link at eleven-thirty, and I approved it at eleven fifty-two, and it had been changed at eleven forty-one, after I’d already looked at it on my phone.</w:t>
+        <w:t xml:space="preserve">Greta, the draft was created at ten fifty-eight on Tuesday night. An hour and forty minutes after Ruth gaveled the meeting closed. And Bernice sent me the link at eleven-thirty, and I approved it at eleven fifty-two, and it had been changed at eleven forty-one, after I’d already looked at it on my phone.</w:t>
       </w:r>
       <w:r>
         <w:t xml:space="preserve">”</w:t>
@@ -14597,7 +14597,7 @@
           <w:iCs/>
           <w:i/>
         </w:rPr>
-        <w:t xml:space="preserve">Tues. 9:02. Back in the room. Remained there like a fool with my hands on the table, not trusting my mouth. Walked out at 9:14. Called G.L. Steno. Seven a.m.</w:t>
+        <w:t xml:space="preserve">Tues. 9:09. Back in the room. Remained there like a fool with my hands on the table, not trusting my mouth. Walked out at 9:14. Called G.L. Steno. Seven a.m.</w:t>
       </w:r>
     </w:p>
     <w:p>
@@ -14695,7 +14695,7 @@
           <w:iCs/>
           <w:i/>
         </w:rPr>
-        <w:t xml:space="preserve">Survey signed 7/2. Comment closed 6/30. Thirteen words of law and a stamp. That’s all they need.</w:t>
+        <w:t xml:space="preserve">Survey signed 7/2. Comment closed 6/30. A signature and a stamp. That’s all they need.</w:t>
       </w:r>
     </w:p>
     <w:p>
@@ -16321,7 +16321,7 @@
         <w:t xml:space="preserve">“</w:t>
       </w:r>
       <w:r>
-        <w:t xml:space="preserve">I left the meeting early. I did leave early. I had a client to think about, and a long drive. I went out the back way while the council was still talking, and I didn’t come back until the next morning, when Helen called me.</w:t>
+        <w:t xml:space="preserve">I left the meeting early. I did leave early. I had a client to think about, and a long drive. I went out the back way while the council was still talking, and I came back in only long enough to collect my notebook.</w:t>
       </w:r>
       <w:r>
         <w:t xml:space="preserve">”</w:t>
@@ -16431,7 +16431,7 @@
         <w:t xml:space="preserve">“</w:t>
       </w:r>
       <w:r>
-        <w:t xml:space="preserve">Did not he?</w:t>
+        <w:t xml:space="preserve">Didn’t he?</w:t>
       </w:r>
       <w:r>
         <w:t xml:space="preserve">”</w:t>
@@ -16856,7 +16856,7 @@
         <w:t xml:space="preserve">“</w:t>
       </w:r>
       <w:r>
-        <w:t xml:space="preserve">And to know she could say what she liked about it, and nobody would be able to prove her wrong, because the only other copy was in a house that had been emptied out.</w:t>
+        <w:t xml:space="preserve">And to know she could say what she liked about it, and nobody would be able to prove her wrong, because the only other copy had been swept out of a trash bin by a scheduled task.</w:t>
       </w:r>
       <w:r>
         <w:t xml:space="preserve">”</w:t>
@@ -16920,7 +16920,7 @@
         <w:t xml:space="preserve">“</w:t>
       </w:r>
       <w:r>
-        <w:t xml:space="preserve">But a gain event on one channel doesn’t stop a coffee urn in the lobby, and it doesn’t stop a refrigerator on the other side of a wall. The urn kept gurgling through every other second of that recess, and it stopped with everything else at eight fifty-two. Whoever cut that file cut the whole building out, Priya, not one microphone.</w:t>
+        <w:t xml:space="preserve">But a gain event on one channel doesn’t stop a coffee urn in the lobby, and it doesn’t stop a refrigerator on the other side of a wall. The urn kept gurgling through the rest of that recess, and it stopped with everything else at eight fifty-two. Whoever cut that file cut the whole building out, Priya, not one microphone.</w:t>
       </w:r>
       <w:r>
         <w:t xml:space="preserve">”</w:t>
@@ -17511,7 +17511,7 @@
         <w:t xml:space="preserve">“</w:t>
       </w:r>
       <w:r>
-        <w:t xml:space="preserve">She never left the room. She sat with that green folder on her knees for the whole meeting, and she didn’t take a single note after Dale spoke about the survey. She was looking at the folder as if it might bite her.</w:t>
+        <w:t xml:space="preserve">She never left the room during the recess. She sat with that green folder on her knees for the whole meeting, and she didn’t take a single note after Dale spoke about the survey. She was looking at the folder as if it might bite her.</w:t>
       </w:r>
       <w:r>
         <w:t xml:space="preserve">”</w:t>
@@ -17969,7 +17969,7 @@
         <w:t xml:space="preserve">“</w:t>
       </w:r>
       <w:r>
-        <w:t xml:space="preserve">I didn’t think anything of it. I thought it was some tourist who’d got lost on the way to the lake. Then I saw the car again on Monday, when you and I drove out of Fennick Falls and it was sitting in the gravel lot behind that house. I didn’t say anything. It was none of my business.</w:t>
+        <w:t xml:space="preserve">I didn’t think anything of it. I thought it was some tourist who’d got lost on the way to the lake. Then I saw the car again on Monday, when you and I drove out of Fennick Falls and it was sitting in the gravel lot behind that house. I didn’t say anything until we got there. It was none of my business.</w:t>
       </w:r>
       <w:r>
         <w:t xml:space="preserve">”</w:t>
@@ -18934,7 +18934,7 @@
         <w:t xml:space="preserve">“</w:t>
       </w:r>
       <w:r>
-        <w:t xml:space="preserve">That’s what the sheriff said, too. He was up here on Thursday asking the same questions. He wrote it all down in a little book and told me not to leave town.</w:t>
+        <w:t xml:space="preserve">That’s what the sheriff said, too. He was up here last Thursday asking the same questions. He wrote it all down in a little book and told me not to leave town.</w:t>
       </w:r>
       <w:r>
         <w:t xml:space="preserve">”</w:t>
@@ -19006,17 +19006,17 @@
         <w:t xml:space="preserve">“</w:t>
       </w:r>
       <w:r>
-        <w:t xml:space="preserve">He wrote your initials in it.</w:t>
-      </w:r>
-      <w:r>
-        <w:t xml:space="preserve"> </w:t>
-      </w:r>
-      <w:r>
-        <w:rPr>
-          <w:iCs/>
-          <w:i/>
-        </w:rPr>
-        <w:t xml:space="preserve">B.L.</w:t>
+        <w:t xml:space="preserve">He wrote your name in it.</w:t>
+      </w:r>
+      <w:r>
+        <w:t xml:space="preserve"> </w:t>
+      </w:r>
+      <w:r>
+        <w:rPr>
+          <w:iCs/>
+          <w:i/>
+        </w:rPr>
+        <w:t xml:space="preserve">Bo L.</w:t>
       </w:r>
       <w:r>
         <w:t xml:space="preserve"> </w:t>
@@ -21111,7 +21111,7 @@
         <w:t xml:space="preserve">“</w:t>
       </w:r>
       <w:r>
-        <w:t xml:space="preserve">That’s what it says, Greta. Four times. I wrote it four times, like a schoolboy doing punishment lines. I didn’t go in.</w:t>
+        <w:t xml:space="preserve">That’s what it says, Greta. Three times. I wrote it three times, like a schoolboy doing punishment lines. I didn’t go in.</w:t>
       </w:r>
       <w:r>
         <w:t xml:space="preserve">”</w:t>
@@ -21607,7 +21607,7 @@
         <w:t xml:space="preserve">“</w:t>
       </w:r>
       <w:r>
-        <w:t xml:space="preserve">She turned her head toward the water, and I saw her profile through the windshield. Gray cardigan. Hair pinned up at the back. And the bangles on her left wrist, flashing in the sun when she moved her hand away from her cheek. I’d know that sound anywhere. I sat next to it for three hours on Tuesday night.</w:t>
+        <w:t xml:space="preserve">She turned her head toward the water, and I saw her profile through the windshield. Gray cardigan. Hair pinned up at the back. And the bangles on her left wrist, flashing in the sun when she moved her hand away from her cheek. I’d know that sound anywhere. I sat next to it for two hours on Tuesday night.</w:t>
       </w:r>
       <w:r>
         <w:t xml:space="preserve">”</w:t>
@@ -21814,17 +21814,17 @@
         <w:pStyle w:val="BodyText"/>
       </w:pPr>
       <w:r>
-        <w:t xml:space="preserve">They sat in silence for a while. The cabin was warm now, and the coffee was bitter and strong. Greta looked at the sheet of paper on the table, with its four careful lines of</w:t>
-      </w:r>
-      <w:r>
-        <w:t xml:space="preserve"> </w:t>
-      </w:r>
-      <w:r>
-        <w:rPr>
-          <w:iCs/>
-          <w:i/>
-        </w:rPr>
-        <w:t xml:space="preserve">didn’t go in</w:t>
+        <w:t xml:space="preserve">They sat in silence for a while. The cabin was warm now, and the coffee was bitter and strong. Greta looked at the sheet of paper on the table, with its three careful lines of</w:t>
+      </w:r>
+      <w:r>
+        <w:t xml:space="preserve"> </w:t>
+      </w:r>
+      <w:r>
+        <w:rPr>
+          <w:iCs/>
+          <w:i/>
+        </w:rPr>
+        <w:t xml:space="preserve">did not go in</w:t>
       </w:r>
       <w:r>
         <w:t xml:space="preserve">, and thought of a clerk who had typed a sentence she did not understand, and a man who had walked up Pier Street with his hands in his pockets, looking like a man on the way to a fight.</w:t>
@@ -22004,7 +22004,7 @@
         <w:t xml:space="preserve">“</w:t>
       </w:r>
       <w:r>
-        <w:t xml:space="preserve">Four times. I wrote it four times.</w:t>
+        <w:t xml:space="preserve">Three times. I wrote it three times.</w:t>
       </w:r>
       <w:r>
         <w:t xml:space="preserve">”</w:t>
@@ -23106,7 +23106,7 @@
         <w:t xml:space="preserve">“</w:t>
       </w:r>
       <w:r>
-        <w:t xml:space="preserve">I’m going to Judge Vickers on Sunday afternoon, with everything I’ve got. The logs. The bangle. Walt’s four lines. Tessa’s photographs. Ted’s statement, which he’s giving me this afternoon. Helen’s approval time, and the invoice, and the purchase order that says</w:t>
+        <w:t xml:space="preserve">I’m going to Judge Vickers on Sunday afternoon, with everything I’ve got. The logs. The bangle. Walt’s three lines. Tessa’s photographs. Ted’s statement, which he’s giving me this afternoon. Helen’s approval time, and the invoice, and the purchase order that says</w:t>
       </w:r>
       <w:r>
         <w:t xml:space="preserve"> </w:t>
@@ -24025,7 +24025,7 @@
         <w:pStyle w:val="BodyText"/>
       </w:pPr>
       <w:r>
-        <w:t xml:space="preserve">It was a long, dense table of rows, each one with a time stamp and an action. Most of the entries were routine: a file uploaded, a file opened, a file closed. Helen’s name appeared several times in the early evening of Tuesday, July 14, each time with the single word</w:t>
+        <w:t xml:space="preserve">It was a long, dense table of rows, each one with a time stamp and an action. Most of the entries were routine: a file uploaded, a file opened, a file closed. Helen’s name appeared several times in the late evening of Tuesday, July 14, each time with the single word</w:t>
       </w:r>
       <w:r>
         <w:t xml:space="preserve"> </w:t>
@@ -24053,7 +24053,7 @@
           <w:iCs/>
           <w:i/>
         </w:rPr>
-        <w:t xml:space="preserve">07/14/2026 11:47:02 PM — oakes-tx — Opened — CC_0714_Regular.wav — Workstation: OT-03.</w:t>
+        <w:t xml:space="preserve">07/14/2026 11:36:02 PM — oakes-tx — Opened — CC_0714_Regular.wav — Workstation: OT-03.</w:t>
       </w:r>
     </w:p>
     <w:p>
@@ -24298,7 +24298,7 @@
         <w:t xml:space="preserve">“</w:t>
       </w:r>
       <w:r>
-        <w:t xml:space="preserve">And the log recorded her at six thirty-one. And a fisherman saw her car at six-twelve, and a woman saw her sitting in it on Pier Street at six-forty, with her hand pressed to her face.</w:t>
+        <w:t xml:space="preserve">And the log recorded her at six thirty-one. And a fisherman saw her car at six-twelve, and Walt Brandt watched her drive away at six-forty with her hand pressed to her face.</w:t>
       </w:r>
       <w:r>
         <w:t xml:space="preserve">”</w:t>
@@ -24631,7 +24631,7 @@
         <w:pStyle w:val="BodyText"/>
       </w:pPr>
       <w:r>
-        <w:t xml:space="preserve">Inside was a single card, heavy and cream-colored, with a deckled edge. She knew the stock at once. She had seen it on Tuesday in a bunch of white lilies on a casket, tucked into the arrangement with a card that said</w:t>
+        <w:t xml:space="preserve">Inside was a single card, heavy and cream-colored, with a deckled edge. She knew the stock at once. She had seen it on Saturday in a bunch of white lilies on a casket, tucked into the arrangement with a card that said</w:t>
       </w:r>
       <w:r>
         <w:t xml:space="preserve"> </w:t>
@@ -25960,7 +25960,7 @@
         <w:t xml:space="preserve">“</w:t>
       </w:r>
       <w:r>
-        <w:t xml:space="preserve">Ted Vance, last Thursday, on foot, after dark. Priya, most days. You, on Saturday, with the bad coffee.</w:t>
+        <w:t xml:space="preserve">Ted Vance, last Thursday, on foot, after dark. Priya, most days.</w:t>
       </w:r>
       <w:r>
         <w:t xml:space="preserve">”</w:t>
@@ -28265,7 +28265,7 @@
         <w:pStyle w:val="BodyText"/>
       </w:pPr>
       <w:r>
-        <w:t xml:space="preserve">She picked up her canvas bag from the hall chair, checked the zip, and felt the stiff edge of the tape folded inside it, and the photocopy of Dale Whitcomb’s notebook, and the typed transcript she had finished at four o’clock that morning, after Sam’s call. She set the bag on her shoulder. Then she knelt on the rug and rubbed Judge’s ears one last time, and he tolerated it with his eyes half closed.</w:t>
+        <w:t xml:space="preserve">She picked up her canvas bag from the hall chair, checked the zip, and felt the stiff edge of the tape folded inside it, and the photocopy of Dale Whitcomb’s notebook, and the typed transcript she had finished at noon, after Sam’s eight o’clock call. She set the bag on her shoulder. Then she knelt on the rug and rubbed Judge’s ears one last time, and he tolerated it with his eyes half closed.</w:t>
       </w:r>
     </w:p>
     <w:p>
@@ -28698,7 +28698,7 @@
           <w:iCs/>
           <w:i/>
         </w:rPr>
-        <w:t xml:space="preserve">Harbor. July 15, 2026. 6:33 AM. Duration 6:45.</w:t>
+        <w:t xml:space="preserve">Harbor. July 15, 2026. 6:33 AM. Duration 4:52.</w:t>
       </w:r>
     </w:p>
     <w:p>
@@ -28714,7 +28714,7 @@
         <w:pStyle w:val="BodyText"/>
       </w:pPr>
       <w:r>
-        <w:t xml:space="preserve">For the first few seconds there was only the hiss of a small microphone in a room with a high ceiling, and the faint, distant clatter of an old radiator. Then came a sound that Greta knew at once, though it had been ten days since she had last heard it: the heavy metal scrape of a door opening on a hinge that needed oil.</w:t>
+        <w:t xml:space="preserve">For the first few seconds there was only the hiss of a small microphone in a room with a high ceiling, and the faint, distant clatter of an old radiator. Then came a sound that Greta knew at once, though it had been twelve days since she had last heard it: the heavy metal scrape of a door opening on a hinge that needed oil.</w:t>
       </w:r>
     </w:p>
     <w:p>
@@ -31233,7 +31233,7 @@
         <w:t xml:space="preserve">“</w:t>
       </w:r>
       <w:r>
-        <w:t xml:space="preserve">No motion was made to approve the lease. No vote was taken on it. The minutes prepared from the audio were altered after the meeting. The statement attributed to Commissioner Whitcomb during the recess was not made in this room, and the reporter did not hear it. The tape shows a silence of fourteen minutes and eleven seconds.</w:t>
+        <w:t xml:space="preserve">No motion was made to approve the lease. No vote was taken on it. The minutes prepared from the audio were altered after the meeting. The statement attributed to Commissioner Whitcomb during the recess was not made in this room, and the reporter did not hear it. The tape shows a silence of fifteen minutes.</w:t>
       </w:r>
       <w:r>
         <w:t xml:space="preserve">”</w:t>
@@ -32425,7 +32425,7 @@
         <w:t xml:space="preserve">“</w:t>
       </w:r>
       <w:r>
-        <w:t xml:space="preserve">fails. One for. Four against.</w:t>
+        <w:t xml:space="preserve">fails. None for. Five against.</w:t>
       </w:r>
       <w:r>
         <w:t xml:space="preserve">”</w:t>
@@ -33474,7 +33474,7 @@
         <w:pStyle w:val="BodyText"/>
       </w:pPr>
       <w:r>
-        <w:t xml:space="preserve">Sam started with the easy things, because he was a careful man. Her name, her date of birth, her address on Juniper Lane, which was rented, and her employer, which was Bernice Oakes Court Reporting, LLC, one employee, two laptops, and a shared office on Front Street that had once belonged to her late husband’s insurance agency. She answered in a clear voice, without hesitation. Greta typed every word, and the machine chattered softly in the close little room, and the fan turned its useless circles.</w:t>
+        <w:t xml:space="preserve">Sam started with the easy things, because he was a careful man. Her name, her date of birth, her address on Cutter Street, which was rented, and her employer, which was Oakes Transcription, LLC, one employee, two laptops, and a second-floor room on Front Street in Lantern Bay that she rented for the council work. She answered in a clear voice, without hesitation. Greta typed every word, and the machine chattered softly in the close little room, and the fan turned its useless circles.</w:t>
       </w:r>
     </w:p>
     <w:p>
@@ -33769,7 +33769,7 @@
         <w:t xml:space="preserve">“</w:t>
       </w:r>
       <w:r>
-        <w:t xml:space="preserve">She’s a child, Deputy, and I’ll say that without any contempt at all. She was frightened of Gordon, and she was very good at her work, and he knew she would do what she was told. I arranged for the surveyor’s office to send a second copy, dated June, to the clerk’s inbox on the thirteenth. Gordon had the original shredded. Tessa took the one she was given and put it in the file. That’s how a comment period closed on the thirtieth of June, in the eyes of the state, for a survey that was signed on the second of July.</w:t>
+        <w:t xml:space="preserve">She’s a child, Deputy, and I’ll say that without any contempt at all. She was frightened of Gordon, and she was very good at her work, and he knew she would do what she was told. I arranged for the surveyor’s office to send a second copy, dated June, to Mr. Strand’s inbox on the thirteenth. Tessa was supposed to swap it into the commission’s file and shred the original. She kept the original instead. That’s how a comment period closed on the thirtieth of June, in the eyes of the state, for a survey that was signed on the second of July.</w:t>
       </w:r>
       <w:r>
         <w:t xml:space="preserve">”</w:t>
@@ -33901,7 +33901,7 @@
         <w:t xml:space="preserve">“</w:t>
       </w:r>
       <w:r>
-        <w:t xml:space="preserve">I prepared the draft from the audio, at my office, on the night of the fourteenth, at ten fifty-eight. I finished the first version by eleven. Then I got a text from Helen at eleven-thirty, with the link, and she was wanting to approve it before she went to bed. So I did something I’d promised myself I would never do in my life. I changed a record after it was made, and I put a sentence in the mouth of a man who had said nothing of the kind.</w:t>
+        <w:t xml:space="preserve">I prepared the draft from the audio, at my office, on the night of the fourteenth, at ten fifty-eight. I finished the first version by eleven. Then I sent Helen a text at eleven-thirty, with the link, because she wanted to approve it before she went to bed. So I did something I’d promised myself I would never do in my life. I changed a record after it was made, and I put a sentence in the mouth of a man who had said nothing of the kind.</w:t>
       </w:r>
       <w:r>
         <w:t xml:space="preserve">”</w:t>
@@ -34117,7 +34117,7 @@
         <w:t xml:space="preserve">“</w:t>
       </w:r>
       <w:r>
-        <w:t xml:space="preserve">In a brown envelope, on the morning of the fifteenth, in his office. Tessa saw it. Gordon told her I would do it, and then he sent me a text saying the job was finished, and I went home and cried at my kitchen table.</w:t>
+        <w:t xml:space="preserve">In a brown envelope, on the morning of the fourteenth, in his office. Tessa saw it. Gordon told her I would do it, and then he sent me a text saying the job was finished, and I went home and cried at my kitchen table.</w:t>
       </w:r>
       <w:r>
         <w:t xml:space="preserve">”</w:t>
@@ -34169,7 +34169,7 @@
         <w:t xml:space="preserve">“</w:t>
       </w:r>
       <w:r>
-        <w:t xml:space="preserve">I had a code. Denise Park gave it to me on the Tuesday, at the Center, when I asked her to set up an after-hours card for the office computers. She’s trusting, Denise. She didn’t ask why I needed it. I told her the county had asked for the transcripts to be kept in the harbor records, which was a lie, but she believed it.</w:t>
+        <w:t xml:space="preserve">I had a code. Denise Park gave it to me on the Tuesday afternoon, at the office, when I asked her for the after-hours card. She’s trusting, Denise. She didn’t ask why I needed it. I told her the county had asked for the transcripts to be kept in the harbor records, which was a lie, but she believed it.</w:t>
       </w:r>
       <w:r>
         <w:t xml:space="preserve">”</w:t>
@@ -34215,7 +34215,7 @@
         <w:t xml:space="preserve">“</w:t>
       </w:r>
       <w:r>
-        <w:t xml:space="preserve">I turned off the trash, so it couldn’t be recovered. And I deleted it.</w:t>
+        <w:t xml:space="preserve">I turned off the trash, so it couldn’t be recovered. I had copied the file to a flash drive first, the way I copy everything. Then I deleted the original.</w:t>
       </w:r>
       <w:r>
         <w:t xml:space="preserve">”</w:t>
@@ -34233,7 +34233,7 @@
         <w:t xml:space="preserve">“</w:t>
       </w:r>
       <w:r>
-        <w:t xml:space="preserve">At six thirty-one. I remember because the clock on the wall was just over the monitor, and I watched the number change while my finger was on the key. I had been waiting in that chair since before six, listening to the water against the ramp, thinking about what I was going to say to him. And when I’d finished, I logged out, and I went to the back steps, and I waited for him to come up from the boat yard. He’d said he’d come by himself, at half past six, and he’d always been a punctual man.</w:t>
+        <w:t xml:space="preserve">At six thirty-one. I remember because the clock on the wall was just over the monitor, and I watched the number change while my finger was on the key. I had been waiting in that chair since before six, listening to the water against the ramp, thinking about what I was going to say to him. And when I’d finished, I logged out, and I went out onto the landing to wait for him. He had told Helen he would come by himself, and he had always been a punctual man.</w:t>
       </w:r>
       <w:r>
         <w:t xml:space="preserve">”</w:t>
@@ -34253,21 +34253,21 @@
         <w:t xml:space="preserve">“</w:t>
       </w:r>
       <w:r>
-        <w:t xml:space="preserve">He had a drive.</w:t>
-      </w:r>
-      <w:r>
-        <w:t xml:space="preserve">”</w:t>
-      </w:r>
-    </w:p>
-    <w:p>
-      <w:pPr>
-        <w:pStyle w:val="BodyText"/>
-      </w:pPr>
-      <w:r>
-        <w:t xml:space="preserve">“</w:t>
-      </w:r>
-      <w:r>
-        <w:t xml:space="preserve">He had a flash drive,</w:t>
+        <w:t xml:space="preserve">You had a drive.</w:t>
+      </w:r>
+      <w:r>
+        <w:t xml:space="preserve">”</w:t>
+      </w:r>
+    </w:p>
+    <w:p>
+      <w:pPr>
+        <w:pStyle w:val="BodyText"/>
+      </w:pPr>
+      <w:r>
+        <w:t xml:space="preserve">“</w:t>
+      </w:r>
+      <w:r>
+        <w:t xml:space="preserve">A flash drive,</w:t>
       </w:r>
       <w:r>
         <w:t xml:space="preserve">”</w:t>
@@ -34285,7 +34285,7 @@
         <w:t xml:space="preserve">“</w:t>
       </w:r>
       <w:r>
-        <w:t xml:space="preserve">A copy of the audio, made from the office server on the night of the fourteenth. He’d made it himself, before the minutes were changed, because he had a suspicious mind and a good memory for the sound of a clock. He’d been carrying it around in his shirt pocket for three weeks. He told Walt Brandt about it at the bait shop, and Walt told Frances Dunn, and I believe the whole harbor knew by Tuesday that Dale had something he wasn’t going to give up.</w:t>
+        <w:t xml:space="preserve">A copy of the original audio, which I had made before I deleted the file, because I wanted to be able to prove later exactly what I had destroyed. I had it in my hand on the landing. I believe someone had told Dale it existed. I never learned who.</w:t>
       </w:r>
       <w:r>
         <w:t xml:space="preserve">”</w:t>
@@ -34313,7 +34313,7 @@
         <w:t xml:space="preserve">“</w:t>
       </w:r>
       <w:r>
-        <w:t xml:space="preserve">He came up the back stairs at six thirty-three, a little out of breath, with his phone in his hand,</w:t>
+        <w:t xml:space="preserve">He had come in through the front at a quarter past six, and he walked the length of the building looking for me. He came out onto the landing at six thirty-three, a little out of breath, with his phone in his hand,</w:t>
       </w:r>
       <w:r>
         <w:t xml:space="preserve">”</w:t>
@@ -34331,23 +34331,23 @@
         <w:t xml:space="preserve">“</w:t>
       </w:r>
       <w:r>
-        <w:t xml:space="preserve">He was filming me before he’d even reached the top. He said,</w:t>
-      </w:r>
-      <w:r>
-        <w:t xml:space="preserve"> </w:t>
-      </w:r>
-      <w:r>
-        <w:rPr>
-          <w:iCs/>
-          <w:i/>
-        </w:rPr>
-        <w:t xml:space="preserve">You’re early.</w:t>
-      </w:r>
-      <w:r>
-        <w:t xml:space="preserve"> </w:t>
-      </w:r>
-      <w:r>
-        <w:t xml:space="preserve">I didn’t say anything for a while. Then I said,</w:t>
+        <w:t xml:space="preserve">He was filming me before he’d even reached the top. I said,</w:t>
+      </w:r>
+      <w:r>
+        <w:t xml:space="preserve"> </w:t>
+      </w:r>
+      <w:r>
+        <w:rPr>
+          <w:iCs/>
+          <w:i/>
+        </w:rPr>
+        <w:t xml:space="preserve">You’re early, Dale.</w:t>
+      </w:r>
+      <w:r>
+        <w:t xml:space="preserve"> </w:t>
+      </w:r>
+      <w:r>
+        <w:t xml:space="preserve">I didn’t say anything else for a while. Then I said,</w:t>
       </w:r>
       <w:r>
         <w:t xml:space="preserve"> </w:t>
@@ -34363,7 +34363,7 @@
         <w:t xml:space="preserve"> </w:t>
       </w:r>
       <w:r>
-        <w:t xml:space="preserve">And then he said I could put the drive down, and I realized he was asking me to put down the drive he was holding, the one he’d made, and I was so tired by then that I simply couldn’t bear it any longer.</w:t>
+        <w:t xml:space="preserve">And then he told me to put the drive down, and I was so tired by then that I simply couldn’t bear it any longer.</w:t>
       </w:r>
       <w:r>
         <w:t xml:space="preserve">”</w:t>
@@ -34399,7 +34399,7 @@
         <w:t xml:space="preserve">“</w:t>
       </w:r>
       <w:r>
-        <w:t xml:space="preserve">I took the drive out of his hand,</w:t>
+        <w:t xml:space="preserve">He took hold of my wrist,</w:t>
       </w:r>
       <w:r>
         <w:t xml:space="preserve">”</w:t>
@@ -34417,7 +34417,7 @@
         <w:t xml:space="preserve">“</w:t>
       </w:r>
       <w:r>
-        <w:t xml:space="preserve">He wouldn’t let go of it, and I didn’t let go of his wrist, and we were both pulling and shouting. Then he let go of the drive, all at once, the way a man does when he’s surprised, and he stepped back to get his balance, and his heel caught on the top step. The one with the crack in it. He went down, Deputy. Backward. He went down the concrete stairs, and I still had his wrist in my hand, and the bangle on my own arm caught his cuff and snapped, and I heard it go. I heard it go like a glass in a sink.</w:t>
+        <w:t xml:space="preserve">I still had the drive in my other hand, and I wouldn’t let go of it, and we were both pulling and shouting. Then the bangle on my arm caught on his cuff and snapped, and I heard it go, like a glass in a sink. The drive skittered across the landing. He let go of me all at once, the way a man does when he’s surprised, and he stepped back to get his balance, and his heel caught on the top step. The one with the crack in it. He went down, Deputy. Backward. He went down the concrete stairs.</w:t>
       </w:r>
       <w:r>
         <w:t xml:space="preserve">”</w:t>
@@ -34498,7 +34498,7 @@
         <w:pStyle w:val="BodyText"/>
       </w:pPr>
       <w:r>
-        <w:t xml:space="preserve">Greta’s fingers moved steadily over the keys. She did not look up. She had known for a long time that this was what the bruises on the wrist would say, and that this was what the railing bolt would say, and that the people who had seen Bernice Oakes walking up the boat ramp that morning with her hand over her face would not be able to say anything different. She did not feel better for knowing it. She only felt the weight of the sentence settle across her shoulders, the way a record did once it was finally complete.</w:t>
+        <w:t xml:space="preserve">Greta’s fingers moved steadily over the keys. She did not look up. She had known for a long time that this was what the bruises on the wrist would say, and that this was what the railing bolt would say, and that the people who had seen Bernice Oakes’s car leave the Harbor Office that morning, with her hand over her face, would not be able to say anything different. She did not feel better for knowing it. She only felt the weight of the sentence settle across her shoulders, the way a record did once it was finally complete.</w:t>
       </w:r>
     </w:p>
     <w:p>
@@ -34693,7 +34693,7 @@
         <w:t xml:space="preserve">“</w:t>
       </w:r>
       <w:r>
-        <w:t xml:space="preserve">My own drive is the one in the grocery bag, in the car. I broke it open at home on Wednesday, with a hammer, on my kitchen floor. I cut my hand doing it. The fragments are wrapped in a towel. I couldn’t put them in the lake, either. I’m sorry, Deputy. I seem to have kept a great many things I should have thrown away.</w:t>
+        <w:t xml:space="preserve">My own drive is the one in the grocery bag, in the car. I broke it open at the office this morning, with a hammer, before I drove north. The fragments are wrapped in a towel. I couldn’t put them in the lake, either. I’m sorry, Deputy. I seem to have kept a great many things I should have thrown away.</w:t>
       </w:r>
       <w:r>
         <w:t xml:space="preserve">”</w:t>
@@ -34768,7 +34768,7 @@
         <w:pStyle w:val="BodyText"/>
       </w:pPr>
       <w:r>
-        <w:t xml:space="preserve">Greta stopped typing. She had reached the end of a page, and the machine’s paper tape had run out a few inches past the edge of the table, and she did not reach for the next fan-fold. She sat with her hands on the cold keys and looked at the woman across the table, who had taught her half of what she knew about the proper form of a transcript, who had once told a judge in Carrow City that a reporter who could not keep her face still had no business in a courtroom, and who had killed a man on the steps of a boat ramp and then sat in the back row of his town’s council chamber and taken its minutes for a week.</w:t>
+        <w:t xml:space="preserve">Greta stopped typing. She had reached the end of a page, and the machine’s paper tape had run out a few inches past the edge of the table, and she did not reach for the next fan-fold. She sat with her hands on the cold keys and looked at the woman across the table, who had taught her half of what she knew about the proper form of a transcript, who had once told a judge in Carrow City that a reporter who could not keep her face still had no business in a courtroom, and who had been on those steps when a man died, and then sat in the back row of his town’s council chamber and taken its minutes for a week.</w:t>
       </w:r>
     </w:p>
     <w:p>
@@ -35108,7 +35108,7 @@
         <w:pStyle w:val="BodyText"/>
       </w:pPr>
       <w:r>
-        <w:t xml:space="preserve">Helen Marsh had resigned as clerk on Monday night, as she had said she would, and the council had accepted the resignation by a vote of five to nothing, with Helen abstaining from her own motion, which she had insisted upon. Her laptop sat closed at the far end of the clerk’s table, beside a neat stack of printed agendas. Frank Marsh had brought her a thermos of tea. She had not touched it.</w:t>
+        <w:t xml:space="preserve">Helen Marsh had resigned as clerk on Monday night, as she had said she would, and the council had accepted the resignation by a vote of five to nothing. Her laptop sat closed at the far end of the clerk’s table, beside a neat stack of printed agendas. Frank Marsh had brought her a thermos of tea. She had not touched it.</w:t>
       </w:r>
     </w:p>
     <w:p>
@@ -35156,7 +35156,7 @@
         <w:pStyle w:val="BodyText"/>
       </w:pPr>
       <w:r>
-        <w:t xml:space="preserve">Greta stood and read the confirmation in a clear voice. She had read it aloud on Monday, but this was the formal version, the one that would go into the town book and the county archive. She had spent the afternoon on the phone with the state records office in Carrow City, a woman named Joan Cho who had been courteous and exact and very fond of the word</w:t>
+        <w:t xml:space="preserve">Greta stood and read the confirmation in a clear voice. She had read it aloud on Monday, but this was the formal version, the one that would go into the town book and the county archive. She had spent the afternoon on the phone with the state records office in Carrow City, a woman named Irene Lasko who had been courteous and exact and very fond of the word</w:t>
       </w:r>
       <w:r>
         <w:t xml:space="preserve"> </w:t>
@@ -35216,7 +35216,7 @@
         <w:t xml:space="preserve">“</w:t>
       </w:r>
       <w:r>
-        <w:t xml:space="preserve">The tape shows a silence of fourteen minutes and eleven seconds during the recess. Greta Lowe, certified reporter.</w:t>
+        <w:t xml:space="preserve">The tape shows a silence of fifteen minutes during the recess. Greta Lowe, certified reporter.</w:t>
       </w:r>
       <w:r>
         <w:t xml:space="preserve">”</w:t>
@@ -35994,7 +35994,7 @@
         <w:t xml:space="preserve">“</w:t>
       </w:r>
       <w:r>
-        <w:t xml:space="preserve">The state reviewers’ session on the north basin paperwork. Joan Cho sent me the audio on Thursday, for the record.</w:t>
+        <w:t xml:space="preserve">The state reviewers’ session on the north basin paperwork. Irene Lasko sent me the audio on Thursday, for the record.</w:t>
       </w:r>
       <w:r>
         <w:t xml:space="preserve">”</w:t>
@@ -36327,7 +36327,7 @@
         <w:pStyle w:val="BodyText"/>
       </w:pPr>
       <w:r>
-        <w:t xml:space="preserve">Greta had read it at the kitchen table and then put it in the drawer where she kept the things that mattered, beside her old steno notebooks from the courthouse in Fennick Falls. She had not answered it. She had not known how.</w:t>
+        <w:t xml:space="preserve">Greta had read it at the kitchen table and then put it in the drawer where she kept the things that mattered, beside her old steno notebooks from the courthouse in Carrow City. She had not answered it. She had not known how.</w:t>
       </w:r>
     </w:p>
     <w:p>
@@ -36423,7 +36423,20 @@
         <w:pStyle w:val="BodyText"/>
       </w:pPr>
       <w:r>
-        <w:t xml:space="preserve">Dale Whitcomb’s boat was still in its slip. His name was still painted across the transom in careful black letters, and nobody had touched it. A memorial for Dale had been held on the water on the first Saturday in August, because Ryan had said his father would have hated a church full of people talking about the weather. The whole fleet had come. Eleven boats had sailed out past the breakwater at noon, in a single slow line, with their horns sounding. Walt had been the last to pass, at the tiller of his old blue trawler, with his hat in his hand and his face wet, and the sound of his horn had carried all the way across the bay, where Ryan stood at the stern of Dale’s boat with his father’s keys in his hand.</w:t>
+        <w:t xml:space="preserve">Dale Whitcomb’s boat was still in its slip. His name was still painted across the transom in careful black letters, and nobody had touched it. A memorial for Dale had been held on the water on the first Saturday in August, because Ryan had said his father would have hated a church full of people talking about the weather. The whole fleet had come. Eleven boats had sailed out past the breakwater at noon, in a single slow line, with their horns sounding. Walt had been the last to pass, at the tiller of the</w:t>
+      </w:r>
+      <w:r>
+        <w:t xml:space="preserve"> </w:t>
+      </w:r>
+      <w:r>
+        <w:rPr>
+          <w:iCs/>
+          <w:i/>
+        </w:rPr>
+        <w:t xml:space="preserve">Mabel Rose</w:t>
+      </w:r>
+      <w:r>
+        <w:t xml:space="preserve">, with his hat in his hand and his face wet, and the sound of his horn had carried all the way across the bay, where Ryan stood at the stern of Dale’s boat with his father’s keys in his hand.</w:t>
       </w:r>
     </w:p>
     <w:p>
@@ -36487,23 +36500,23 @@
         <w:pStyle w:val="BodyText"/>
       </w:pPr>
       <w:r>
-        <w:t xml:space="preserve">Greta picked up the thermos, unscrewed the cap, and poured herself a cup of coffee that had gone lukewarm in the sun. She drank it slowly. Then she took out her phone and opened the email from Joan Cho in Carrow City, which she had read four times that morning and had not yet answered. The attachment was a single spreadsheet, a copy of the county’s audit log for the TownShare account used by the Lantern Bay clerk’s office, pulled for the state review of the July fourteenth minutes, with every login, every file access, and every deletion marked in neat columns of gray type.</w:t>
-      </w:r>
-    </w:p>
-    <w:p>
-      <w:pPr>
-        <w:pStyle w:val="BodyText"/>
-      </w:pPr>
-      <w:r>
-        <w:t xml:space="preserve">Most of it she already knew. The login at five fifty-eight on Wednesday morning, from the back office workstation, under Denise Park’s after-hours code. The trash purge disabled at six twenty-nine. The deletion of the July fourteenth audio at six thirty-one. The logout at six thirty-one and forty-four seconds. Bernice Oakes had told the truth about every one of them, down to the second.</w:t>
-      </w:r>
-    </w:p>
-    <w:p>
-      <w:pPr>
-        <w:pStyle w:val="BodyText"/>
-      </w:pPr>
-      <w:r>
-        <w:t xml:space="preserve">But there was one line on the second page that Greta had not expected, and she had read it three times before she was certain of what it meant. It was dated Tuesday night, the fourteenth of July, at eleven twenty-six p.m. It showed a login to the same account, from a device registered to the Lantern Bay clerk’s office, under the old clerk credentials that had been deactivated in June, when Helen Marsh had changed the password for the first time in eleven years. The session had lasted nine minutes. It had opened the draft minutes file, read it through, and closed again without making any change at all, fifteen minutes before the paragraph about Dale was added.</w:t>
+        <w:t xml:space="preserve">Greta picked up the thermos, unscrewed the cap, and poured herself a cup of coffee that had gone lukewarm in the sun. She drank it slowly. Then she took out her phone and opened the email from Irene Lasko in Carrow City, which she had read four times that morning and had not yet answered. The attachment was a single spreadsheet, a copy of the county’s audit log for the TownShare account used by the Lantern Bay clerk’s office, pulled for the state review of the July fourteenth minutes, with every login, every file access, and every deletion marked in neat columns of gray type.</w:t>
+      </w:r>
+    </w:p>
+    <w:p>
+      <w:pPr>
+        <w:pStyle w:val="BodyText"/>
+      </w:pPr>
+      <w:r>
+        <w:t xml:space="preserve">Most of it she already knew. The login at five fifty-eight on Wednesday morning, from the back office workstation, under the after-hours code Denise Park had reissued. The trash purge disabled at six twenty-nine. The deletion of the July fourteenth audio at six thirty-one. The logout at six thirty-one and forty-four seconds. Bernice Oakes had told the truth about every one of them, down to the second.</w:t>
+      </w:r>
+    </w:p>
+    <w:p>
+      <w:pPr>
+        <w:pStyle w:val="BodyText"/>
+      </w:pPr>
+      <w:r>
+        <w:t xml:space="preserve">But there was one line on the second page that Greta had not expected, and she had read it three times before she was certain of what it meant. It was dated Tuesday night, the fourteenth of July, at eleven twenty-six p.m. It showed a login to the same account, from a device registered to the Lantern Bay clerk’s office, under the old clerk credentials that had been deactivated in June, when Helen Marsh had changed the password for the first time in eleven years. The session had lasted nine minutes. It had opened the draft minutes file, read it through, and closed again without making any change at all, six minutes before the paragraph about Dale was added.</w:t>
       </w:r>
     </w:p>
     <w:p>
@@ -36527,19 +36540,19 @@
         <w:pStyle w:val="BodyText"/>
       </w:pPr>
       <w:r>
-        <w:t xml:space="preserve">She looked up, across the bay, toward the lighthouse, and then toward the lane that ran up the hill behind the marina. Then she picked up her phone and began, very carefully, to type a reply to Joan Cho.</w:t>
-      </w:r>
-    </w:p>
-    <w:p>
-      <w:pPr>
-        <w:pStyle w:val="BodyText"/>
-      </w:pPr>
-      <w:r>
-        <w:rPr>
-          <w:iCs/>
-          <w:i/>
-        </w:rPr>
-        <w:t xml:space="preserve">Please send me the full session record for the ten-fourteen login,</w:t>
+        <w:t xml:space="preserve">She looked up, across the bay, toward the lighthouse, and then toward the lane that ran up the hill behind the marina. Then she picked up her phone and began, very carefully, to type a reply to Irene Lasko.</w:t>
+      </w:r>
+    </w:p>
+    <w:p>
+      <w:pPr>
+        <w:pStyle w:val="BodyText"/>
+      </w:pPr>
+      <w:r>
+        <w:rPr>
+          <w:iCs/>
+          <w:i/>
+        </w:rPr>
+        <w:t xml:space="preserve">Please send me the full session record for the eleven twenty-six login,</w:t>
       </w:r>
       <w:r>
         <w:t xml:space="preserve"> </w:t>

</xml_diff>